<commit_message>
Show what the quest check saw in debug builds, add a threshold sweep
Failed quest photos only say "KHÔNG ĐÚNG", so it is hard to tell a real
model miss from a bad shot. Debug builds (kDebugMode) now append the top
label and the accepted descriptions' share ("DEBUG: a dog 31%"); release
builds are unchanged, so players are still never told what was detected.

server/eval/threshold_sweep.py re-scores the eval photos under different
MATCH_SCORE values. Lowering the threshold barely helps (recall 79% -> 80%
at 0.3 on centred subjects, false accepts 1.3% -> 1.7%), so the threshold is
left at 0.5 until real phone photos say otherwise.

Co-Authored-By: Claude Sonnet 5.5 <noreply@anthropic.com>
</commit_message>
<xml_diff>
--- a/Neo-Brutalism Locket/docs/HUONG_DAN_CHAY_APP.docx
+++ b/Neo-Brutalism Locket/docs/HUONG_DAN_CHAY_APP.docx
@@ -2193,6 +2193,69 @@
                 <w:szCs w:val="20"/>
               </w:rPr>
               <w:t xml:space="preserve">Model chưa nạp được (thiếu file trong assets/quest_model hoặc thiết bị quá yếu). Lượt thử không bị trừ. Chạy lại flutter pub get rồi build lại.</w:t>
+            </w:r>
+          </w:p>
+        </w:tc>
+      </w:tr>
+      <w:tr>
+        <w:trPr>
+          <w:tblHeader w:val="off"/>
+        </w:trPr>
+        <w:tc>
+          <w:tcPr>
+            <w:tcW w:type="dxa" w:w="3000"/>
+            <w:tcBorders>
+              <w:top w:val="single" w:color="BBBBBB" w:sz="4"/>
+              <w:left w:val="single" w:color="BBBBBB" w:sz="4"/>
+              <w:bottom w:val="single" w:color="BBBBBB" w:sz="4"/>
+              <w:right w:val="single" w:color="BBBBBB" w:sz="4"/>
+            </w:tcBorders>
+            <w:tcMar>
+              <w:top w:type="dxa" w:w="70"/>
+              <w:left w:type="dxa" w:w="120"/>
+              <w:bottom w:type="dxa" w:w="70"/>
+              <w:right w:type="dxa" w:w="120"/>
+            </w:tcMar>
+          </w:tcPr>
+          <w:p>
+            <w:r>
+              <w:rPr>
+                <w:rFonts w:ascii="Arial" w:cs="Arial" w:eastAsia="Arial" w:hAnsi="Arial"/>
+                <w:b w:val="false"/>
+                <w:bCs w:val="false"/>
+                <w:sz w:val="20"/>
+                <w:szCs w:val="20"/>
+              </w:rPr>
+              <w:t xml:space="preserve">Quest báo "KHÔNG ĐÚNG" dù chụp đúng</w:t>
+            </w:r>
+          </w:p>
+        </w:tc>
+        <w:tc>
+          <w:tcPr>
+            <w:tcW w:type="dxa" w:w="6026"/>
+            <w:tcBorders>
+              <w:top w:val="single" w:color="BBBBBB" w:sz="4"/>
+              <w:left w:val="single" w:color="BBBBBB" w:sz="4"/>
+              <w:bottom w:val="single" w:color="BBBBBB" w:sz="4"/>
+              <w:right w:val="single" w:color="BBBBBB" w:sz="4"/>
+            </w:tcBorders>
+            <w:tcMar>
+              <w:top w:type="dxa" w:w="70"/>
+              <w:left w:type="dxa" w:w="120"/>
+              <w:bottom w:type="dxa" w:w="70"/>
+              <w:right w:type="dxa" w:w="120"/>
+            </w:tcMar>
+          </w:tcPr>
+          <w:p>
+            <w:r>
+              <w:rPr>
+                <w:rFonts w:ascii="Arial" w:cs="Arial" w:eastAsia="Arial" w:hAnsi="Arial"/>
+                <w:b w:val="false"/>
+                <w:bCs w:val="false"/>
+                <w:sz w:val="20"/>
+                <w:szCs w:val="20"/>
+              </w:rPr>
+              <w:t xml:space="preserve">Chạy bản debug (flutter run, không phải APK release): thông báo sẽ có thêm "DEBUG: nhãn xx%" cho biết model thấy gì và điểm của đáp án đúng. Ghi lại quest, nhãn và điểm rồi gửi cho chủ dự án để chỉnh bộ nhận diện. Bản release không hiện dòng này.</w:t>
             </w:r>
           </w:p>
         </w:tc>

</xml_diff>

<commit_message>
Make the quest model load on Android: float32 maths, float16 storage
The shipped model computed in float16, which loads on a PC but fails on
Android: "ORT_NOT_IMPLEMENTED ... Failed to find kernel for com.microsoft.Gelu
... type (tensor(float16))" (the CPU provider has no float16 Gelu). The export
now stores the big weights as float16 plus a Cast back to float32, so the
file stays 22.9 MB while every operation runs in float32. After ONNX Runtime's
own optimisation the graph has 27 float32 Gelu nodes and no float16 tensor.

Same decisions as the float32 model on the eval photos (0 flips). Golden
fixtures regenerated; onnxconverter-common is no longer needed.

Co-Authored-By: Claude Sonnet 5.5 <noreply@anthropic.com>
</commit_message>
<xml_diff>
--- a/Neo-Brutalism Locket/docs/HUONG_DAN_CHAY_APP.docx
+++ b/Neo-Brutalism Locket/docs/HUONG_DAN_CHAY_APP.docx
@@ -1515,7 +1515,7 @@
           <w:sz w:val="22"/>
           <w:szCs w:val="22"/>
         </w:rPr>
-        <w:t xml:space="preserve">Cài thêm 2 gói chỉ dùng cho bước xuất model (cài vào thư mục riêng, không đụng môi trường server):</w:t>
+        <w:t xml:space="preserve">Cài thêm gói onnx chỉ dùng cho bước xuất model (cài vào thư mục riêng, không đụng môi trường server):</w:t>
       </w:r>
     </w:p>
     <w:tbl>
@@ -1561,7 +1561,7 @@
                 <w:sz w:val="20"/>
                 <w:szCs w:val="20"/>
               </w:rPr>
-              <w:t xml:space="preserve">.\.venv\Scripts\pip install --target .eval_tools --no-deps onnx==1.17.0 onnxconverter-common==1.14.0</w:t>
+              <w:t xml:space="preserve">.\.venv\Scripts\pip install --target .eval_tools --no-deps onnx==1.17.0</w:t>
             </w:r>
           </w:p>
         </w:tc>
@@ -2256,6 +2256,69 @@
                 <w:szCs w:val="20"/>
               </w:rPr>
               <w:t xml:space="preserve">Chạy bản debug (flutter run, không phải APK release): thông báo sẽ có thêm "DEBUG: nhãn xx%" cho biết model thấy gì và điểm của đáp án đúng. Ghi lại quest, nhãn và điểm rồi gửi cho chủ dự án để chỉnh bộ nhận diện. Bản release không hiện dòng này.</w:t>
+            </w:r>
+          </w:p>
+        </w:tc>
+      </w:tr>
+      <w:tr>
+        <w:trPr>
+          <w:tblHeader w:val="off"/>
+        </w:trPr>
+        <w:tc>
+          <w:tcPr>
+            <w:tcW w:type="dxa" w:w="3000"/>
+            <w:tcBorders>
+              <w:top w:val="single" w:color="BBBBBB" w:sz="4"/>
+              <w:left w:val="single" w:color="BBBBBB" w:sz="4"/>
+              <w:bottom w:val="single" w:color="BBBBBB" w:sz="4"/>
+              <w:right w:val="single" w:color="BBBBBB" w:sz="4"/>
+            </w:tcBorders>
+            <w:tcMar>
+              <w:top w:type="dxa" w:w="70"/>
+              <w:left w:type="dxa" w:w="120"/>
+              <w:bottom w:type="dxa" w:w="70"/>
+              <w:right w:type="dxa" w:w="120"/>
+            </w:tcMar>
+          </w:tcPr>
+          <w:p>
+            <w:r>
+              <w:rPr>
+                <w:rFonts w:ascii="Arial" w:cs="Arial" w:eastAsia="Arial" w:hAnsi="Arial"/>
+                <w:b w:val="false"/>
+                <w:bCs w:val="false"/>
+                <w:sz w:val="20"/>
+                <w:szCs w:val="20"/>
+              </w:rPr>
+              <w:t xml:space="preserve">Bản debug báo "ORT_NOT_IMPLEMENTED ... Gelu ... float16"</w:t>
+            </w:r>
+          </w:p>
+        </w:tc>
+        <w:tc>
+          <w:tcPr>
+            <w:tcW w:type="dxa" w:w="6026"/>
+            <w:tcBorders>
+              <w:top w:val="single" w:color="BBBBBB" w:sz="4"/>
+              <w:left w:val="single" w:color="BBBBBB" w:sz="4"/>
+              <w:bottom w:val="single" w:color="BBBBBB" w:sz="4"/>
+              <w:right w:val="single" w:color="BBBBBB" w:sz="4"/>
+            </w:tcBorders>
+            <w:tcMar>
+              <w:top w:type="dxa" w:w="70"/>
+              <w:left w:type="dxa" w:w="120"/>
+              <w:bottom w:type="dxa" w:w="70"/>
+              <w:right w:type="dxa" w:w="120"/>
+            </w:tcMar>
+          </w:tcPr>
+          <w:p>
+            <w:r>
+              <w:rPr>
+                <w:rFonts w:ascii="Arial" w:cs="Arial" w:eastAsia="Arial" w:hAnsi="Arial"/>
+                <w:b w:val="false"/>
+                <w:bCs w:val="false"/>
+                <w:sz w:val="20"/>
+                <w:szCs w:val="20"/>
+              </w:rPr>
+              <w:t xml:space="preserve">Model trong assets/quest_model được xuất với phép tính fp16, điện thoại không chạy được. Xuất lại bằng script hiện tại (Bước 8.3): nó chỉ lưu trọng số dạng fp16, còn phép tính vẫn fp32.</w:t>
             </w:r>
           </w:p>
         </w:tc>

</xml_diff>

<commit_message>
Add on-device face mesh and person mask for 8-bit portraits, plus CI and docs
- Face landmark and selfie segmentation models with decoding, features and mask code
- 8-bit pipeline uses them; cleanup, downscale and palette mapping tweaks
- Quest scoring/preprocess, outbox, repositories and widget updater adjustments
- Colab helpers, model download script, CI workflow and updated docs/tests

Co-Authored-By: Claude Sonnet 5.5 <noreply@anthropic.com>
</commit_message>
<xml_diff>
--- a/Neo-Brutalism Locket/docs/HUONG_DAN_CHAY_APP.docx
+++ b/Neo-Brutalism Locket/docs/HUONG_DAN_CHAY_APP.docx
@@ -612,7 +612,7 @@
                 <w:sz w:val="20"/>
                 <w:szCs w:val="20"/>
               </w:rPr>
-              <w:t xml:space="preserve">  "SUPABASE_URL": "&lt;&lt;DIEN_SUPABASE_URL: chu du an gui rieng&gt;&gt;",</w:t>
+              <w:t xml:space="preserve">  "SUPABASE_URL": "https://mqzpvxmgkulmgvvbhjjn.supabase.co",</w:t>
             </w:r>
           </w:p>
           <w:p>
@@ -625,7 +625,7 @@
                 <w:sz w:val="20"/>
                 <w:szCs w:val="20"/>
               </w:rPr>
-              <w:t xml:space="preserve">  "SUPABASE_PUBLISHABLE_KEY": "&lt;&lt;DIEN_PUBLISHABLE_KEY: chu du an gui rieng&gt;&gt;"</w:t>
+              <w:t xml:space="preserve">  "SUPABASE_PUBLISHABLE_KEY": "sb_publishable_Eslcapc8hnLWk36lksrqFQ_wNEQaDBX"</w:t>
             </w:r>
           </w:p>
           <w:p>
@@ -1055,7 +1055,7 @@
         <w:rPr>
           <w:rFonts w:ascii="Arial" w:cs="Arial" w:eastAsia="Arial" w:hAnsi="Arial"/>
         </w:rPr>
-        <w:t xml:space="preserve">8.2 Server AI trên laptop (chỉ cho Van Gogh chất lượng cao)</w:t>
+        <w:t xml:space="preserve">8.2 Server AI cho Van Gogh chất lượng cao (Google Colab hoặc laptop)</w:t>
       </w:r>
     </w:p>
     <w:p>
@@ -1068,7 +1068,61 @@
           <w:sz w:val="22"/>
           <w:szCs w:val="22"/>
         </w:rPr>
-        <w:t xml:space="preserve">Việc duy nhất cần server Python trên laptop có card NVIDIA là chuyển ảnh sang phong cách Van Gogh bằng Stable Diffusion.</w:t>
+        <w:t xml:space="preserve">Việc duy nhất cần server là chuyển ảnh sang phong cách Van Gogh bằng Stable Diffusion (cần GPU). Có 3 cách, chọn một:</w:t>
+      </w:r>
+    </w:p>
+    <w:p>
+      <w:pPr>
+        <w:pStyle w:val="ListParagraph"/>
+        <w:numPr>
+          <w:ilvl w:val="0"/>
+          <w:numId w:val="2"/>
+        </w:numPr>
+        <w:spacing w:after="60"/>
+      </w:pPr>
+      <w:r>
+        <w:rPr>
+          <w:rFonts w:ascii="Arial" w:cs="Arial" w:eastAsia="Arial" w:hAnsi="Arial"/>
+          <w:sz w:val="22"/>
+          <w:szCs w:val="22"/>
+        </w:rPr>
+        <w:t xml:space="preserve">Cách A, dùng chung (dễ nhất cho thành viên): chủ dự án bật server trên Google Colab (xem "Mỗi lần bật server" bên dưới) và gửi cho bạn địa chỉ https và token. Bạn không cài gì, chỉ nhập hai giá trị đó vào app. Địa chỉ đổi mỗi lần chủ dự án bật lại, nên mỗi lần phải hỏi địa chỉ mới (token thì giữ nguyên nếu chủ dự án đặt secret).</w:t>
+      </w:r>
+    </w:p>
+    <w:p>
+      <w:pPr>
+        <w:pStyle w:val="ListParagraph"/>
+        <w:numPr>
+          <w:ilvl w:val="0"/>
+          <w:numId w:val="2"/>
+        </w:numPr>
+        <w:spacing w:after="60"/>
+      </w:pPr>
+      <w:r>
+        <w:rPr>
+          <w:rFonts w:ascii="Arial" w:cs="Arial" w:eastAsia="Arial" w:hAnsi="Arial"/>
+          <w:sz w:val="22"/>
+          <w:szCs w:val="22"/>
+        </w:rPr>
+        <w:t xml:space="preserve">Cách B, Colab của riêng bạn: làm lại phần "Thiết lập Colab một lần" trên tài khoản Google của bạn (miễn phí, không cần thẻ, không cần xác minh số điện thoại).</w:t>
+      </w:r>
+    </w:p>
+    <w:p>
+      <w:pPr>
+        <w:pStyle w:val="ListParagraph"/>
+        <w:numPr>
+          <w:ilvl w:val="0"/>
+          <w:numId w:val="2"/>
+        </w:numPr>
+        <w:spacing w:after="60"/>
+      </w:pPr>
+      <w:r>
+        <w:rPr>
+          <w:rFonts w:ascii="Arial" w:cs="Arial" w:eastAsia="Arial" w:hAnsi="Arial"/>
+          <w:sz w:val="22"/>
+          <w:szCs w:val="22"/>
+        </w:rPr>
+        <w:t xml:space="preserve">Cách C, chạy trên laptop có card NVIDIA: xem "Dựng server trên laptop" bên dưới.</w:t>
       </w:r>
     </w:p>
     <w:p>
@@ -1083,15 +1137,15 @@
           <w:sz w:val="22"/>
           <w:szCs w:val="22"/>
         </w:rPr>
-        <w:t xml:space="preserve">Kiểm tra ảnh quest hằng ngày không cần server nữa: </w:t>
-      </w:r>
-      <w:r>
-        <w:rPr>
-          <w:rFonts w:ascii="Arial" w:cs="Arial" w:eastAsia="Arial" w:hAnsi="Arial"/>
-          <w:sz w:val="22"/>
-          <w:szCs w:val="22"/>
-        </w:rPr>
-        <w:t xml:space="preserve">app chạy model nhận diện ngay trên điện thoại (không cần mạng, không cần laptop). Phong cách 8-bit và bản Van Gogh nhẹ cũng chạy trực tiếp trên điện thoại.</w:t>
+        <w:t xml:space="preserve">Không cần server cũng dùng được app: </w:t>
+      </w:r>
+      <w:r>
+        <w:rPr>
+          <w:rFonts w:ascii="Arial" w:cs="Arial" w:eastAsia="Arial" w:hAnsi="Arial"/>
+          <w:sz w:val="22"/>
+          <w:szCs w:val="22"/>
+        </w:rPr>
+        <w:t xml:space="preserve">kiểm tra ảnh quest hằng ngày chạy trên điện thoại (không cần mạng), phong cách 8-bit và bản Van Gogh nhẹ cũng chạy trực tiếp trên điện thoại. App tự dùng bản nhẹ khi chưa nhập server.</w:t>
       </w:r>
     </w:p>
     <w:p>
@@ -1101,10 +1155,20 @@
       <w:r>
         <w:rPr>
           <w:rFonts w:ascii="Arial" w:cs="Arial" w:eastAsia="Arial" w:hAnsi="Arial"/>
-          <w:sz w:val="22"/>
-          <w:szCs w:val="22"/>
-        </w:rPr>
-        <w:t xml:space="preserve">Các bước dựng server (cần Python 3.10+ và driver NVIDIA/CUDA):</w:t>
+          <w:b/>
+          <w:bCs/>
+          <w:sz w:val="22"/>
+          <w:szCs w:val="22"/>
+        </w:rPr>
+        <w:t xml:space="preserve">Thiết lập Colab một lần. </w:t>
+      </w:r>
+      <w:r>
+        <w:rPr>
+          <w:rFonts w:ascii="Arial" w:cs="Arial" w:eastAsia="Arial" w:hAnsi="Arial"/>
+          <w:sz w:val="22"/>
+          <w:szCs w:val="22"/>
+        </w:rPr>
+        <w:t xml:space="preserve">Cần Python 3.10+ trên máy tính và một tài khoản Google.</w:t>
       </w:r>
     </w:p>
     <w:p>
@@ -1122,7 +1186,7 @@
           <w:sz w:val="22"/>
           <w:szCs w:val="22"/>
         </w:rPr>
-        <w:t xml:space="preserve">Tạo môi trường và cài thư viện:</w:t>
+        <w:t xml:space="preserve">Đóng gói code engine thành một file nhỏ (khoảng 3 MB):</w:t>
       </w:r>
     </w:p>
     <w:tbl>
@@ -1181,20 +1245,7 @@
                 <w:sz w:val="20"/>
                 <w:szCs w:val="20"/>
               </w:rPr>
-              <w:t xml:space="preserve">python -m venv .venv</w:t>
-            </w:r>
-          </w:p>
-          <w:p>
-            <w:pPr>
-              <w:spacing w:after="0"/>
-            </w:pPr>
-            <w:r>
-              <w:rPr>
-                <w:rFonts w:ascii="Consolas" w:cs="Consolas" w:eastAsia="Consolas" w:hAnsi="Consolas"/>
-                <w:sz w:val="20"/>
-                <w:szCs w:val="20"/>
-              </w:rPr>
-              <w:t xml:space="preserve">.\.venv\Scripts\pip install -r requirements.txt</w:t>
+              <w:t xml:space="preserve">python colab/pack_code.py</w:t>
             </w:r>
           </w:p>
         </w:tc>
@@ -1220,7 +1271,531 @@
           <w:sz w:val="22"/>
           <w:szCs w:val="22"/>
         </w:rPr>
-        <w:t xml:space="preserve">Tải model (nặng, vài GB, cần kết nối ổn định):</w:t>
+        <w:t xml:space="preserve">Mở Google Drive, tạo thư mục tên locket (đường dẫn MyDrive/locket) và tải file server/colab/_staging/server.tar lên đó.</w:t>
+      </w:r>
+    </w:p>
+    <w:p>
+      <w:pPr>
+        <w:pStyle w:val="ListParagraph"/>
+        <w:numPr>
+          <w:ilvl w:val="0"/>
+          <w:numId w:val="4"/>
+        </w:numPr>
+        <w:spacing w:after="80"/>
+      </w:pPr>
+      <w:r>
+        <w:rPr>
+          <w:rFonts w:ascii="Arial" w:cs="Arial" w:eastAsia="Arial" w:hAnsi="Arial"/>
+          <w:sz w:val="22"/>
+          <w:szCs w:val="22"/>
+        </w:rPr>
+        <w:t xml:space="preserve">Mở https://colab.research.google.com → File → Upload notebook → chọn server/colab/locket_server.ipynb.</w:t>
+      </w:r>
+    </w:p>
+    <w:p>
+      <w:pPr>
+        <w:pStyle w:val="ListParagraph"/>
+        <w:numPr>
+          <w:ilvl w:val="0"/>
+          <w:numId w:val="4"/>
+        </w:numPr>
+        <w:spacing w:after="80"/>
+      </w:pPr>
+      <w:r>
+        <w:rPr>
+          <w:rFonts w:ascii="Arial" w:cs="Arial" w:eastAsia="Arial" w:hAnsi="Arial"/>
+          <w:sz w:val="22"/>
+          <w:szCs w:val="22"/>
+        </w:rPr>
+        <w:t xml:space="preserve">(Không bắt buộc) Ở thanh bên trái của Colab, bấm biểu tượng chìa khóa (Secrets), thêm secret tên LOCKET_TOKEN với giá trị là một chuỗi dài ngẫu nhiên (lấy bằng python -c "import secrets;print(secrets.token_urlsafe(24))") và bật "Notebook access". Đây là token cố định để khỏi phải đổi token mỗi lần. Nếu bỏ qua, mỗi phiên sẽ có một token ngẫu nhiên được in ra.</w:t>
+      </w:r>
+    </w:p>
+    <w:p>
+      <w:pPr>
+        <w:spacing w:after="120"/>
+      </w:pPr>
+      <w:r>
+        <w:rPr>
+          <w:rFonts w:ascii="Arial" w:cs="Arial" w:eastAsia="Arial" w:hAnsi="Arial"/>
+          <w:b/>
+          <w:bCs/>
+          <w:sz w:val="22"/>
+          <w:szCs w:val="22"/>
+        </w:rPr>
+        <w:t xml:space="preserve">Mỗi lần bật server. </w:t>
+      </w:r>
+      <w:r>
+        <w:rPr>
+          <w:rFonts w:ascii="Arial" w:cs="Arial" w:eastAsia="Arial" w:hAnsi="Arial"/>
+          <w:sz w:val="22"/>
+          <w:szCs w:val="22"/>
+        </w:rPr>
+        <w:t xml:space="preserve">Ước tính (chưa đo trên Colab thật): lần đầu khoảng 15-20 phút vì phải tải model; các lần sau khoảng 8-10 phút, phần lớn là cài thư viện và nạp model.</w:t>
+      </w:r>
+    </w:p>
+    <w:p>
+      <w:pPr>
+        <w:pStyle w:val="ListParagraph"/>
+        <w:numPr>
+          <w:ilvl w:val="0"/>
+          <w:numId w:val="5"/>
+        </w:numPr>
+        <w:spacing w:after="80"/>
+      </w:pPr>
+      <w:r>
+        <w:rPr>
+          <w:rFonts w:ascii="Arial" w:cs="Arial" w:eastAsia="Arial" w:hAnsi="Arial"/>
+          <w:sz w:val="22"/>
+          <w:szCs w:val="22"/>
+        </w:rPr>
+        <w:t xml:space="preserve">Mở notebook trên Colab → Runtime → Change runtime type → chọn T4 GPU → Save.</w:t>
+      </w:r>
+    </w:p>
+    <w:p>
+      <w:pPr>
+        <w:pStyle w:val="ListParagraph"/>
+        <w:numPr>
+          <w:ilvl w:val="0"/>
+          <w:numId w:val="5"/>
+        </w:numPr>
+        <w:spacing w:after="80"/>
+      </w:pPr>
+      <w:r>
+        <w:rPr>
+          <w:rFonts w:ascii="Arial" w:cs="Arial" w:eastAsia="Arial" w:hAnsi="Arial"/>
+          <w:sz w:val="22"/>
+          <w:szCs w:val="22"/>
+        </w:rPr>
+        <w:t xml:space="preserve">Runtime → Run all. Khi được hỏi, cho phép truy cập Google Drive.</w:t>
+      </w:r>
+    </w:p>
+    <w:p>
+      <w:pPr>
+        <w:pStyle w:val="ListParagraph"/>
+        <w:numPr>
+          <w:ilvl w:val="0"/>
+          <w:numId w:val="5"/>
+        </w:numPr>
+        <w:spacing w:after="80"/>
+      </w:pPr>
+      <w:r>
+        <w:rPr>
+          <w:rFonts w:ascii="Arial" w:cs="Arial" w:eastAsia="Arial" w:hAnsi="Arial"/>
+          <w:sz w:val="22"/>
+          <w:szCs w:val="22"/>
+        </w:rPr>
+        <w:t xml:space="preserve">Đợi. Lần đầu notebook tải khoảng 6 GB model và lưu vào Drive (file models.tar) để lần sau không tải lại. Cuối cùng ô cuối in khung "Address" (dạng https://xxxx.trycloudflare.com) và "Token".</w:t>
+      </w:r>
+    </w:p>
+    <w:p>
+      <w:pPr>
+        <w:pStyle w:val="ListParagraph"/>
+        <w:numPr>
+          <w:ilvl w:val="0"/>
+          <w:numId w:val="5"/>
+        </w:numPr>
+        <w:spacing w:after="80"/>
+      </w:pPr>
+      <w:r>
+        <w:rPr>
+          <w:rFonts w:ascii="Arial" w:cs="Arial" w:eastAsia="Arial" w:hAnsi="Arial"/>
+          <w:sz w:val="22"/>
+          <w:szCs w:val="22"/>
+        </w:rPr>
+        <w:t xml:space="preserve">Trong app: màn hình camera → biểu tượng server màu xanh → dán Address và Token → TEST → SAVE. Có thể kiểm tra bằng cách mở &lt;Address&gt;/v1/health trên trình duyệt.</w:t>
+      </w:r>
+    </w:p>
+    <w:p>
+      <w:pPr>
+        <w:pStyle w:val="ListParagraph"/>
+        <w:numPr>
+          <w:ilvl w:val="0"/>
+          <w:numId w:val="5"/>
+        </w:numPr>
+        <w:spacing w:after="80"/>
+      </w:pPr>
+      <w:r>
+        <w:rPr>
+          <w:rFonts w:ascii="Arial" w:cs="Arial" w:eastAsia="Arial" w:hAnsi="Arial"/>
+          <w:sz w:val="22"/>
+          <w:szCs w:val="22"/>
+        </w:rPr>
+        <w:t xml:space="preserve">Để ô cuối của notebook chạy trong lúc dùng app (đừng đóng tab). Dùng xong thì Runtime → Disconnect and delete runtime.</w:t>
+      </w:r>
+    </w:p>
+    <w:p>
+      <w:pPr>
+        <w:pStyle w:val="ListParagraph"/>
+        <w:numPr>
+          <w:ilvl w:val="0"/>
+          <w:numId w:val="2"/>
+        </w:numPr>
+        <w:spacing w:after="60"/>
+      </w:pPr>
+      <w:r>
+        <w:rPr>
+          <w:rFonts w:ascii="Arial" w:cs="Arial" w:eastAsia="Arial" w:hAnsi="Arial"/>
+          <w:sz w:val="22"/>
+          <w:szCs w:val="22"/>
+        </w:rPr>
+        <w:t xml:space="preserve">Địa chỉ đổi mỗi lần bật. Token giữ nguyên nếu bạn đã đặt secret LOCKET_TOKEN.</w:t>
+      </w:r>
+    </w:p>
+    <w:p>
+      <w:pPr>
+        <w:pStyle w:val="ListParagraph"/>
+        <w:numPr>
+          <w:ilvl w:val="0"/>
+          <w:numId w:val="2"/>
+        </w:numPr>
+        <w:spacing w:after="60"/>
+      </w:pPr>
+      <w:r>
+        <w:rPr>
+          <w:rFonts w:ascii="Arial" w:cs="Arial" w:eastAsia="Arial" w:hAnsi="Arial"/>
+          <w:sz w:val="22"/>
+          <w:szCs w:val="22"/>
+        </w:rPr>
+        <w:t xml:space="preserve">Giới hạn: Colab miễn phí có thể ngắt phiên bất cứ lúc nào (rảnh quá lâu, hết thời gian tối đa, hoặc hết hạn mức GPU). Khi bị ngắt thì bật lại và nhập địa chỉ mới vào app. Phải bật tay mỗi lần dùng, phù hợp để demo hoặc nhóm nhỏ, không phải dịch vụ chạy 24/7.</w:t>
+      </w:r>
+    </w:p>
+    <w:p>
+      <w:pPr>
+        <w:pStyle w:val="ListParagraph"/>
+        <w:numPr>
+          <w:ilvl w:val="0"/>
+          <w:numId w:val="2"/>
+        </w:numPr>
+        <w:spacing w:after="60"/>
+      </w:pPr>
+      <w:r>
+        <w:rPr>
+          <w:rFonts w:ascii="Arial" w:cs="Arial" w:eastAsia="Arial" w:hAnsi="Arial"/>
+          <w:sz w:val="22"/>
+          <w:szCs w:val="22"/>
+        </w:rPr>
+        <w:t xml:space="preserve">Sau khi sửa engine ảnh (thư mục server): chạy lại python colab/pack_code.py, thay file server.tar trong thư mục locket trên Drive, rồi bật lại notebook. Nếu thêm model mới thì xóa luôn file models.tar trên Drive để nó được tạo lại.</w:t>
+      </w:r>
+    </w:p>
+    <w:p>
+      <w:pPr>
+        <w:pStyle w:val="ListParagraph"/>
+        <w:numPr>
+          <w:ilvl w:val="0"/>
+          <w:numId w:val="2"/>
+        </w:numPr>
+        <w:spacing w:after="60"/>
+      </w:pPr>
+      <w:r>
+        <w:rPr>
+          <w:rFonts w:ascii="Arial" w:cs="Arial" w:eastAsia="Arial" w:hAnsi="Arial"/>
+          <w:sz w:val="22"/>
+          <w:szCs w:val="22"/>
+        </w:rPr>
+        <w:t xml:space="preserve">Muốn thành viên khác tự bật: gửi cho họ file server.tar và notebook, họ làm lại phần thiết lập trên tài khoản Google của họ.</w:t>
+      </w:r>
+    </w:p>
+    <w:p>
+      <w:pPr>
+        <w:spacing w:after="120"/>
+      </w:pPr>
+      <w:r>
+        <w:rPr>
+          <w:rFonts w:ascii="Arial" w:cs="Arial" w:eastAsia="Arial" w:hAnsi="Arial"/>
+          <w:b/>
+          <w:bCs/>
+          <w:sz w:val="22"/>
+          <w:szCs w:val="22"/>
+        </w:rPr>
+        <w:t xml:space="preserve">Về bảo mật: </w:t>
+      </w:r>
+      <w:r>
+        <w:rPr>
+          <w:rFonts w:ascii="Arial" w:cs="Arial" w:eastAsia="Arial" w:hAnsi="Arial"/>
+          <w:sz w:val="22"/>
+          <w:szCs w:val="22"/>
+        </w:rPr>
+        <w:t xml:space="preserve">ảnh của người dùng đi qua máy chủ của Google và Cloudflare (đường hầm) để xử lý, không được lưu lại. Chỉ chia sẻ địa chỉ và token cho người bạn tin tưởng, và xem lại điều khoản sử dụng của Colab nếu dùng ngoài mục đích demo.</w:t>
+      </w:r>
+    </w:p>
+    <w:p>
+      <w:pPr>
+        <w:spacing w:after="120"/>
+      </w:pPr>
+      <w:r>
+        <w:rPr>
+          <w:rFonts w:ascii="Arial" w:cs="Arial" w:eastAsia="Arial" w:hAnsi="Arial"/>
+          <w:b/>
+          <w:bCs/>
+          <w:sz w:val="22"/>
+          <w:szCs w:val="22"/>
+        </w:rPr>
+        <w:t xml:space="preserve">Notebook Colab nối với app như thế nào. </w:t>
+      </w:r>
+      <w:r>
+        <w:rPr>
+          <w:rFonts w:ascii="Arial" w:cs="Arial" w:eastAsia="Arial" w:hAnsi="Arial"/>
+          <w:sz w:val="22"/>
+          <w:szCs w:val="22"/>
+        </w:rPr>
+        <w:t xml:space="preserve">Điện thoại không nói chuyện trực tiếp với Colab, mà đi qua một địa chỉ công khai do notebook tạo ra:</w:t>
+      </w:r>
+    </w:p>
+    <w:p>
+      <w:pPr>
+        <w:pStyle w:val="ListParagraph"/>
+        <w:numPr>
+          <w:ilvl w:val="0"/>
+          <w:numId w:val="2"/>
+        </w:numPr>
+        <w:spacing w:after="60"/>
+      </w:pPr>
+      <w:r>
+        <w:rPr>
+          <w:rFonts w:ascii="Arial" w:cs="Arial" w:eastAsia="Arial" w:hAnsi="Arial"/>
+          <w:sz w:val="22"/>
+          <w:szCs w:val="22"/>
+        </w:rPr>
+        <w:t xml:space="preserve">Ô 1-2: kiểm tra GPU, nối Google Drive và giải nén code engine từ server.tar.</w:t>
+      </w:r>
+    </w:p>
+    <w:p>
+      <w:pPr>
+        <w:pStyle w:val="ListParagraph"/>
+        <w:numPr>
+          <w:ilvl w:val="0"/>
+          <w:numId w:val="2"/>
+        </w:numPr>
+        <w:spacing w:after="60"/>
+      </w:pPr>
+      <w:r>
+        <w:rPr>
+          <w:rFonts w:ascii="Arial" w:cs="Arial" w:eastAsia="Arial" w:hAnsi="Arial"/>
+          <w:sz w:val="22"/>
+          <w:szCs w:val="22"/>
+        </w:rPr>
+        <w:t xml:space="preserve">Ô 3: cài thư viện vào một môi trường riêng Python 3.12 (Colab dùng Python 3.13 nên không cài trực tiếp được thư viện của server).</w:t>
+      </w:r>
+    </w:p>
+    <w:p>
+      <w:pPr>
+        <w:pStyle w:val="ListParagraph"/>
+        <w:numPr>
+          <w:ilvl w:val="0"/>
+          <w:numId w:val="2"/>
+        </w:numPr>
+        <w:spacing w:after="60"/>
+      </w:pPr>
+      <w:r>
+        <w:rPr>
+          <w:rFonts w:ascii="Arial" w:cs="Arial" w:eastAsia="Arial" w:hAnsi="Arial"/>
+          <w:sz w:val="22"/>
+          <w:szCs w:val="22"/>
+        </w:rPr>
+        <w:t xml:space="preserve">Ô 4: lấy model (từ Drive nếu đã có models.tar, không thì tải về rồi lưu vào Drive).</w:t>
+      </w:r>
+    </w:p>
+    <w:p>
+      <w:pPr>
+        <w:pStyle w:val="ListParagraph"/>
+        <w:numPr>
+          <w:ilvl w:val="0"/>
+          <w:numId w:val="2"/>
+        </w:numPr>
+        <w:spacing w:after="60"/>
+      </w:pPr>
+      <w:r>
+        <w:rPr>
+          <w:rFonts w:ascii="Arial" w:cs="Arial" w:eastAsia="Arial" w:hAnsi="Arial"/>
+          <w:sz w:val="22"/>
+          <w:szCs w:val="22"/>
+        </w:rPr>
+        <w:t xml:space="preserve">Ô 5-6: đọc token (secret LOCKET_TOKEN hoặc tạo ngẫu nhiên) rồi chạy server chính là code trong thư mục server, lắng nghe trong máy Colab.</w:t>
+      </w:r>
+    </w:p>
+    <w:p>
+      <w:pPr>
+        <w:pStyle w:val="ListParagraph"/>
+        <w:numPr>
+          <w:ilvl w:val="0"/>
+          <w:numId w:val="2"/>
+        </w:numPr>
+        <w:spacing w:after="60"/>
+      </w:pPr>
+      <w:r>
+        <w:rPr>
+          <w:rFonts w:ascii="Arial" w:cs="Arial" w:eastAsia="Arial" w:hAnsi="Arial"/>
+          <w:sz w:val="22"/>
+          <w:szCs w:val="22"/>
+        </w:rPr>
+        <w:t xml:space="preserve">Ô 7: bật đường hầm Cloudflare, nó tạo ra địa chỉ dạng https://xxxx.trycloudflare.com trỏ vào server đó. Đây là địa chỉ bạn nhập vào app.</w:t>
+      </w:r>
+    </w:p>
+    <w:p>
+      <w:pPr>
+        <w:pStyle w:val="ListParagraph"/>
+        <w:numPr>
+          <w:ilvl w:val="0"/>
+          <w:numId w:val="2"/>
+        </w:numPr>
+        <w:spacing w:after="60"/>
+      </w:pPr>
+      <w:r>
+        <w:rPr>
+          <w:rFonts w:ascii="Arial" w:cs="Arial" w:eastAsia="Arial" w:hAnsi="Arial"/>
+          <w:sz w:val="22"/>
+          <w:szCs w:val="22"/>
+        </w:rPr>
+        <w:t xml:space="preserve">Ô 8: giữ phiên sống và tự bật lại server hoặc đường hầm nếu một trong hai chết (khi đường hầm bật lại, địa chỉ mới được in ra).</w:t>
+      </w:r>
+    </w:p>
+    <w:p>
+      <w:pPr>
+        <w:spacing w:after="120"/>
+      </w:pPr>
+      <w:r>
+        <w:rPr>
+          <w:rFonts w:ascii="Arial" w:cs="Arial" w:eastAsia="Arial" w:hAnsi="Arial"/>
+          <w:sz w:val="22"/>
+          <w:szCs w:val="22"/>
+        </w:rPr>
+        <w:t xml:space="preserve">Trong app, bạn nhập Address và Token đúng một lần cho mỗi phiên Colab (màn hình camera → biểu tượng server → TEST → SAVE). Từ đó, khi bạn chọn phong cách Van Gogh, app gửi ảnh tới địa chỉ đó, chờ server vẽ xong rồi tải ảnh kết quả về. Không cần sửa code app. Nếu địa chỉ hoặc token sai, hoặc phiên Colab đã tắt, app không tạo được ảnh Van Gogh và dùng lại bản nhẹ trên điện thoại.</w:t>
+      </w:r>
+    </w:p>
+    <w:p>
+      <w:pPr>
+        <w:spacing w:after="120"/>
+      </w:pPr>
+      <w:r>
+        <w:rPr>
+          <w:rFonts w:ascii="Arial" w:cs="Arial" w:eastAsia="Arial" w:hAnsi="Arial"/>
+          <w:b/>
+          <w:bCs/>
+          <w:sz w:val="22"/>
+          <w:szCs w:val="22"/>
+        </w:rPr>
+        <w:t xml:space="preserve">Mất bao lâu. </w:t>
+      </w:r>
+      <w:r>
+        <w:rPr>
+          <w:rFonts w:ascii="Arial" w:cs="Arial" w:eastAsia="Arial" w:hAnsi="Arial"/>
+          <w:sz w:val="22"/>
+          <w:szCs w:val="22"/>
+        </w:rPr>
+        <w:t xml:space="preserve">Các con số dưới đây là ước tính, chưa đo trên Colab thật:</w:t>
+      </w:r>
+    </w:p>
+    <w:p>
+      <w:pPr>
+        <w:pStyle w:val="ListParagraph"/>
+        <w:numPr>
+          <w:ilvl w:val="0"/>
+          <w:numId w:val="2"/>
+        </w:numPr>
+        <w:spacing w:after="60"/>
+      </w:pPr>
+      <w:r>
+        <w:rPr>
+          <w:rFonts w:ascii="Arial" w:cs="Arial" w:eastAsia="Arial" w:hAnsi="Arial"/>
+          <w:sz w:val="22"/>
+          <w:szCs w:val="22"/>
+        </w:rPr>
+        <w:t xml:space="preserve">Bật server mỗi phiên: khoảng 8-10 phút (lần đầu khoảng 15-20 phút). Chỉ phải làm khi bắt đầu dùng, không phải mỗi ảnh.</w:t>
+      </w:r>
+    </w:p>
+    <w:p>
+      <w:pPr>
+        <w:pStyle w:val="ListParagraph"/>
+        <w:numPr>
+          <w:ilvl w:val="0"/>
+          <w:numId w:val="2"/>
+        </w:numPr>
+        <w:spacing w:after="60"/>
+      </w:pPr>
+      <w:r>
+        <w:rPr>
+          <w:rFonts w:ascii="Arial" w:cs="Arial" w:eastAsia="Arial" w:hAnsi="Arial"/>
+          <w:sz w:val="22"/>
+          <w:szCs w:val="22"/>
+        </w:rPr>
+        <w:t xml:space="preserve">Một ảnh Van Gogh khi server đã chạy: khoảng 10-20 giây cộng vài giây truyền ảnh qua mạng. Để so sánh, laptop RTX 3050 6 GB đo được khoảng 16 giây mỗi ảnh. GPU T4 của Colab có nhiều bộ nhớ hơn nên thường không chậm hơn, nhưng cần đo lại.</w:t>
+      </w:r>
+    </w:p>
+    <w:p>
+      <w:pPr>
+        <w:pStyle w:val="ListParagraph"/>
+        <w:numPr>
+          <w:ilvl w:val="0"/>
+          <w:numId w:val="2"/>
+        </w:numPr>
+        <w:spacing w:after="60"/>
+      </w:pPr>
+      <w:r>
+        <w:rPr>
+          <w:rFonts w:ascii="Arial" w:cs="Arial" w:eastAsia="Arial" w:hAnsi="Arial"/>
+          <w:sz w:val="22"/>
+          <w:szCs w:val="22"/>
+        </w:rPr>
+        <w:t xml:space="preserve">Ảnh đầu tiên sau khi server vừa bật có thể chậm hơn vài giây. Hàng đợi tối đa 4 ảnh cùng lúc, ảnh thứ 5 sẽ bị báo bận.</w:t>
+      </w:r>
+    </w:p>
+    <w:p>
+      <w:pPr>
+        <w:pStyle w:val="ListParagraph"/>
+        <w:numPr>
+          <w:ilvl w:val="0"/>
+          <w:numId w:val="2"/>
+        </w:numPr>
+        <w:spacing w:after="60"/>
+      </w:pPr>
+      <w:r>
+        <w:rPr>
+          <w:rFonts w:ascii="Arial" w:cs="Arial" w:eastAsia="Arial" w:hAnsi="Arial"/>
+          <w:sz w:val="22"/>
+          <w:szCs w:val="22"/>
+        </w:rPr>
+        <w:t xml:space="preserve">Phong cách 8-bit và bản Van Gogh nhẹ chạy trên điện thoại, mất dưới 1 giây (8-bit) và không phụ thuộc server.</w:t>
+      </w:r>
+    </w:p>
+    <w:p>
+      <w:pPr>
+        <w:spacing w:after="120"/>
+      </w:pPr>
+      <w:r>
+        <w:rPr>
+          <w:rFonts w:ascii="Arial" w:cs="Arial" w:eastAsia="Arial" w:hAnsi="Arial"/>
+          <w:b/>
+          <w:bCs/>
+          <w:sz w:val="22"/>
+          <w:szCs w:val="22"/>
+        </w:rPr>
+        <w:t xml:space="preserve">Dựng server trên laptop (Cách C). </w:t>
+      </w:r>
+      <w:r>
+        <w:rPr>
+          <w:rFonts w:ascii="Arial" w:cs="Arial" w:eastAsia="Arial" w:hAnsi="Arial"/>
+          <w:sz w:val="22"/>
+          <w:szCs w:val="22"/>
+        </w:rPr>
+        <w:t xml:space="preserve">Cần Python 3.10+ và driver NVIDIA/CUDA.</w:t>
+      </w:r>
+    </w:p>
+    <w:p>
+      <w:pPr>
+        <w:pStyle w:val="ListParagraph"/>
+        <w:numPr>
+          <w:ilvl w:val="0"/>
+          <w:numId w:val="6"/>
+        </w:numPr>
+        <w:spacing w:after="80"/>
+      </w:pPr>
+      <w:r>
+        <w:rPr>
+          <w:rFonts w:ascii="Arial" w:cs="Arial" w:eastAsia="Arial" w:hAnsi="Arial"/>
+          <w:sz w:val="22"/>
+          <w:szCs w:val="22"/>
+        </w:rPr>
+        <w:t xml:space="preserve">Tạo môi trường và cài thư viện:</w:t>
       </w:r>
     </w:p>
     <w:tbl>
@@ -1266,7 +1841,33 @@
                 <w:sz w:val="20"/>
                 <w:szCs w:val="20"/>
               </w:rPr>
-              <w:t xml:space="preserve">.\.venv\Scripts\python download_models.py</w:t>
+              <w:t xml:space="preserve">cd server</w:t>
+            </w:r>
+          </w:p>
+          <w:p>
+            <w:pPr>
+              <w:spacing w:after="0"/>
+            </w:pPr>
+            <w:r>
+              <w:rPr>
+                <w:rFonts w:ascii="Consolas" w:cs="Consolas" w:eastAsia="Consolas" w:hAnsi="Consolas"/>
+                <w:sz w:val="20"/>
+                <w:szCs w:val="20"/>
+              </w:rPr>
+              <w:t xml:space="preserve">python -m venv .venv</w:t>
+            </w:r>
+          </w:p>
+          <w:p>
+            <w:pPr>
+              <w:spacing w:after="0"/>
+            </w:pPr>
+            <w:r>
+              <w:rPr>
+                <w:rFonts w:ascii="Consolas" w:cs="Consolas" w:eastAsia="Consolas" w:hAnsi="Consolas"/>
+                <w:sz w:val="20"/>
+                <w:szCs w:val="20"/>
+              </w:rPr>
+              <w:t xml:space="preserve">..venvScriptspip install -r requirements.txt</w:t>
             </w:r>
           </w:p>
         </w:tc>
@@ -1282,7 +1883,7 @@
         <w:pStyle w:val="ListParagraph"/>
         <w:numPr>
           <w:ilvl w:val="0"/>
-          <w:numId w:val="4"/>
+          <w:numId w:val="6"/>
         </w:numPr>
         <w:spacing w:after="80"/>
       </w:pPr>
@@ -1292,7 +1893,7 @@
           <w:sz w:val="22"/>
           <w:szCs w:val="22"/>
         </w:rPr>
-        <w:t xml:space="preserve">Chạy server (lần đầu mất khoảng 1 phút để nạp model), ghi lại token được in ra:</w:t>
+        <w:t xml:space="preserve">Tải model (nặng, vài GB, cần kết nối ổn định):</w:t>
       </w:r>
     </w:p>
     <w:tbl>
@@ -1338,7 +1939,7 @@
                 <w:sz w:val="20"/>
                 <w:szCs w:val="20"/>
               </w:rPr>
-              <w:t xml:space="preserve">.\run_server.ps1</w:t>
+              <w:t xml:space="preserve">..venvScriptspython download_models.py</w:t>
             </w:r>
           </w:p>
         </w:tc>
@@ -1354,7 +1955,7 @@
         <w:pStyle w:val="ListParagraph"/>
         <w:numPr>
           <w:ilvl w:val="0"/>
-          <w:numId w:val="4"/>
+          <w:numId w:val="6"/>
         </w:numPr>
         <w:spacing w:after="80"/>
       </w:pPr>
@@ -1364,7 +1965,7 @@
           <w:sz w:val="22"/>
           <w:szCs w:val="22"/>
         </w:rPr>
-        <w:t xml:space="preserve">Kết nối điện thoại. Cách dễ nhất là qua cáp USB:</w:t>
+        <w:t xml:space="preserve">Chạy server (lần đầu mất khoảng 1 phút để nạp model), ghi lại token được in ra:</w:t>
       </w:r>
     </w:p>
     <w:tbl>
@@ -1410,7 +2011,8 @@
                 <w:sz w:val="20"/>
                 <w:szCs w:val="20"/>
               </w:rPr>
-              <w:t xml:space="preserve">adb reverse tcp:8765 tcp:8765</w:t>
+              <w:t xml:space="preserve">.
+un_server.ps1</w:t>
             </w:r>
           </w:p>
         </w:tc>
@@ -1426,7 +2028,7 @@
         <w:pStyle w:val="ListParagraph"/>
         <w:numPr>
           <w:ilvl w:val="0"/>
-          <w:numId w:val="4"/>
+          <w:numId w:val="6"/>
         </w:numPr>
         <w:spacing w:after="80"/>
       </w:pPr>
@@ -1436,86 +2038,7 @@
           <w:sz w:val="22"/>
           <w:szCs w:val="22"/>
         </w:rPr>
-        <w:t xml:space="preserve">Trong app: màn hình camera → biểu tượng server màu xanh → nhập địa chỉ 127.0.0.1:8765 và token → TEST → SAVE.</w:t>
-      </w:r>
-    </w:p>
-    <w:p>
-      <w:pPr>
-        <w:spacing w:after="120"/>
-      </w:pPr>
-      <w:r>
-        <w:rPr>
-          <w:rFonts w:ascii="Arial" w:cs="Arial" w:eastAsia="Arial" w:hAnsi="Arial"/>
-          <w:sz w:val="22"/>
-          <w:szCs w:val="22"/>
-        </w:rPr>
-        <w:t xml:space="preserve">Kết nối qua Wi-Fi cần mở firewall và đặt mạng ở chế độ Private, xem server/README.md.</w:t>
-      </w:r>
-    </w:p>
-    <w:p>
-      <w:pPr>
-        <w:spacing w:after="120"/>
-      </w:pPr>
-      <w:r>
-        <w:rPr>
-          <w:rFonts w:ascii="Arial" w:cs="Arial" w:eastAsia="Arial" w:hAnsi="Arial"/>
-          <w:b/>
-          <w:bCs/>
-          <w:sz w:val="22"/>
-          <w:szCs w:val="22"/>
-        </w:rPr>
-        <w:t xml:space="preserve">Lưu ý: </w:t>
-      </w:r>
-      <w:r>
-        <w:rPr>
-          <w:rFonts w:ascii="Arial" w:cs="Arial" w:eastAsia="Arial" w:hAnsi="Arial"/>
-          <w:sz w:val="22"/>
-          <w:szCs w:val="22"/>
-        </w:rPr>
-        <w:t xml:space="preserve">server chạy trên máy của từng người, nên token và địa chỉ là riêng của bạn. Chỉ database là dùng chung.</w:t>
-      </w:r>
-    </w:p>
-    <w:p>
-      <w:pPr>
-        <w:pStyle w:val="Heading2"/>
-        <w:spacing w:after="100" w:before="200"/>
-      </w:pPr>
-      <w:r>
-        <w:rPr>
-          <w:rFonts w:ascii="Arial" w:cs="Arial" w:eastAsia="Arial" w:hAnsi="Arial"/>
-        </w:rPr>
-        <w:t xml:space="preserve">8.3 Dành cho người phát triển: thêm hoặc sửa quest</w:t>
-      </w:r>
-    </w:p>
-    <w:p>
-      <w:pPr>
-        <w:spacing w:after="120"/>
-      </w:pPr>
-      <w:r>
-        <w:rPr>
-          <w:rFonts w:ascii="Arial" w:cs="Arial" w:eastAsia="Arial" w:hAnsi="Arial"/>
-          <w:sz w:val="22"/>
-          <w:szCs w:val="22"/>
-        </w:rPr>
-        <w:t xml:space="preserve">Model kiểm tra ảnh quest dùng bộ mô tả đã được tính sẵn cho từng quest (assets/quest_model/quest_labels.json và quest_labels.bin). Khi bạn thêm quest mới, đổi positives hoặc negatives trong lib/features/quest/quest_catalog.dart, phải tạo lại hai file này, nếu không test quest_on_device_test sẽ báo lỗi và quest mới sẽ báo "chưa có trong bộ kiểm ảnh". Việc này cần chạy trong thư mục server (đã cài môi trường ở Bước 8.2):</w:t>
-      </w:r>
-    </w:p>
-    <w:p>
-      <w:pPr>
-        <w:pStyle w:val="ListParagraph"/>
-        <w:numPr>
-          <w:ilvl w:val="0"/>
-          <w:numId w:val="5"/>
-        </w:numPr>
-        <w:spacing w:after="80"/>
-      </w:pPr>
-      <w:r>
-        <w:rPr>
-          <w:rFonts w:ascii="Arial" w:cs="Arial" w:eastAsia="Arial" w:hAnsi="Arial"/>
-          <w:sz w:val="22"/>
-          <w:szCs w:val="22"/>
-        </w:rPr>
-        <w:t xml:space="preserve">Cài thêm gói onnx chỉ dùng cho bước xuất model (cài vào thư mục riêng, không đụng môi trường server):</w:t>
+        <w:t xml:space="preserve">Kết nối điện thoại. Cách dễ nhất là qua cáp USB:</w:t>
       </w:r>
     </w:p>
     <w:tbl>
@@ -1561,7 +2084,7 @@
                 <w:sz w:val="20"/>
                 <w:szCs w:val="20"/>
               </w:rPr>
-              <w:t xml:space="preserve">.\.venv\Scripts\pip install --target .eval_tools --no-deps onnx==1.17.0</w:t>
+              <w:t xml:space="preserve">adb reverse tcp:8765 tcp:8765</w:t>
             </w:r>
           </w:p>
         </w:tc>
@@ -1577,7 +2100,7 @@
         <w:pStyle w:val="ListParagraph"/>
         <w:numPr>
           <w:ilvl w:val="0"/>
-          <w:numId w:val="5"/>
+          <w:numId w:val="6"/>
         </w:numPr>
         <w:spacing w:after="80"/>
       </w:pPr>
@@ -1587,7 +2110,86 @@
           <w:sz w:val="22"/>
           <w:szCs w:val="22"/>
         </w:rPr>
-        <w:t xml:space="preserve">Xuất lại model và bộ mô tả vào assets (lần đầu tự tải model MobileCLIP2-S0, vài trăm MB):</w:t>
+        <w:t xml:space="preserve">Trong app: màn hình camera → biểu tượng server màu xanh → nhập địa chỉ 127.0.0.1:8765 và token → TEST → SAVE.</w:t>
+      </w:r>
+    </w:p>
+    <w:p>
+      <w:pPr>
+        <w:spacing w:after="120"/>
+      </w:pPr>
+      <w:r>
+        <w:rPr>
+          <w:rFonts w:ascii="Arial" w:cs="Arial" w:eastAsia="Arial" w:hAnsi="Arial"/>
+          <w:sz w:val="22"/>
+          <w:szCs w:val="22"/>
+        </w:rPr>
+        <w:t xml:space="preserve">Kết nối qua Wi-Fi cần mở firewall và đặt mạng ở chế độ Private, xem server/README.md.</w:t>
+      </w:r>
+    </w:p>
+    <w:p>
+      <w:pPr>
+        <w:spacing w:after="120"/>
+      </w:pPr>
+      <w:r>
+        <w:rPr>
+          <w:rFonts w:ascii="Arial" w:cs="Arial" w:eastAsia="Arial" w:hAnsi="Arial"/>
+          <w:b/>
+          <w:bCs/>
+          <w:sz w:val="22"/>
+          <w:szCs w:val="22"/>
+        </w:rPr>
+        <w:t xml:space="preserve">Lưu ý: </w:t>
+      </w:r>
+      <w:r>
+        <w:rPr>
+          <w:rFonts w:ascii="Arial" w:cs="Arial" w:eastAsia="Arial" w:hAnsi="Arial"/>
+          <w:sz w:val="22"/>
+          <w:szCs w:val="22"/>
+        </w:rPr>
+        <w:t xml:space="preserve">server laptop chạy trên máy của từng người nên token và địa chỉ là riêng của bạn. Server Colab thì cả nhóm có thể dùng chung địa chỉ và token trong lúc chủ dự án đang bật. Chỉ database là luôn dùng chung.</w:t>
+      </w:r>
+    </w:p>
+    <w:p>
+      <w:pPr>
+        <w:pStyle w:val="Heading2"/>
+        <w:spacing w:after="100" w:before="200"/>
+      </w:pPr>
+      <w:r>
+        <w:rPr>
+          <w:rFonts w:ascii="Arial" w:cs="Arial" w:eastAsia="Arial" w:hAnsi="Arial"/>
+        </w:rPr>
+        <w:t xml:space="preserve">8.3 Dành cho người phát triển: thêm hoặc sửa quest</w:t>
+      </w:r>
+    </w:p>
+    <w:p>
+      <w:pPr>
+        <w:spacing w:after="120"/>
+      </w:pPr>
+      <w:r>
+        <w:rPr>
+          <w:rFonts w:ascii="Arial" w:cs="Arial" w:eastAsia="Arial" w:hAnsi="Arial"/>
+          <w:sz w:val="22"/>
+          <w:szCs w:val="22"/>
+        </w:rPr>
+        <w:t xml:space="preserve">Model kiểm tra ảnh quest dùng bộ mô tả đã được tính sẵn cho từng quest (assets/quest_model/quest_labels.json và quest_labels.bin). Khi bạn thêm quest mới, đổi positives hoặc negatives trong lib/features/quest/quest_catalog.dart, phải tạo lại hai file này, nếu không test quest_on_device_test sẽ báo lỗi và quest mới sẽ báo "chưa có trong bộ kiểm ảnh". Việc này cần chạy trong thư mục server (đã cài môi trường ở Bước 8.2):</w:t>
+      </w:r>
+    </w:p>
+    <w:p>
+      <w:pPr>
+        <w:pStyle w:val="ListParagraph"/>
+        <w:numPr>
+          <w:ilvl w:val="0"/>
+          <w:numId w:val="7"/>
+        </w:numPr>
+        <w:spacing w:after="80"/>
+      </w:pPr>
+      <w:r>
+        <w:rPr>
+          <w:rFonts w:ascii="Arial" w:cs="Arial" w:eastAsia="Arial" w:hAnsi="Arial"/>
+          <w:sz w:val="22"/>
+          <w:szCs w:val="22"/>
+        </w:rPr>
+        <w:t xml:space="preserve">Cài thêm gói onnx chỉ dùng cho bước xuất model (cài vào thư mục riêng, không đụng môi trường server):</w:t>
       </w:r>
     </w:p>
     <w:tbl>
@@ -1633,9 +2235,68 @@
                 <w:sz w:val="20"/>
                 <w:szCs w:val="20"/>
               </w:rPr>
-              <w:t xml:space="preserve">$env:PYTHONPATH = ".eval_tools"</w:t>
-            </w:r>
-          </w:p>
+              <w:t xml:space="preserve">.\.venv\Scripts\pip install --target .eval_tools --no-deps onnx==1.17.0</w:t>
+            </w:r>
+          </w:p>
+        </w:tc>
+      </w:tr>
+    </w:tbl>
+    <w:p>
+      <w:pPr>
+        <w:spacing w:after="80"/>
+      </w:pPr>
+    </w:p>
+    <w:p>
+      <w:pPr>
+        <w:pStyle w:val="ListParagraph"/>
+        <w:numPr>
+          <w:ilvl w:val="0"/>
+          <w:numId w:val="7"/>
+        </w:numPr>
+        <w:spacing w:after="80"/>
+      </w:pPr>
+      <w:r>
+        <w:rPr>
+          <w:rFonts w:ascii="Arial" w:cs="Arial" w:eastAsia="Arial" w:hAnsi="Arial"/>
+          <w:sz w:val="22"/>
+          <w:szCs w:val="22"/>
+        </w:rPr>
+        <w:t xml:space="preserve">Xuất lại model và bộ mô tả vào assets (lần đầu tự tải model MobileCLIP2-S0, vài trăm MB):</w:t>
+      </w:r>
+    </w:p>
+    <w:tbl>
+      <w:tblPr>
+        <w:tblW w:type="dxa" w:w="9026"/>
+        <w:tblBorders>
+          <w:top w:val="single" w:color="auto" w:sz="4"/>
+          <w:left w:val="single" w:color="auto" w:sz="4"/>
+          <w:bottom w:val="single" w:color="auto" w:sz="4"/>
+          <w:right w:val="single" w:color="auto" w:sz="4"/>
+          <w:insideH w:val="single" w:color="auto" w:sz="4"/>
+          <w:insideV w:val="single" w:color="auto" w:sz="4"/>
+        </w:tblBorders>
+      </w:tblPr>
+      <w:tblGrid>
+        <w:gridCol w:w="9026"/>
+      </w:tblGrid>
+      <w:tr>
+        <w:tc>
+          <w:tcPr>
+            <w:tcW w:type="dxa" w:w="9026"/>
+            <w:tcBorders>
+              <w:top w:val="single" w:color="BBBBBB" w:sz="4"/>
+              <w:left w:val="single" w:color="BBBBBB" w:sz="4"/>
+              <w:bottom w:val="single" w:color="BBBBBB" w:sz="4"/>
+              <w:right w:val="single" w:color="BBBBBB" w:sz="4"/>
+            </w:tcBorders>
+            <w:shd w:fill="F2F2F2" w:color="auto" w:val="clear"/>
+            <w:tcMar>
+              <w:top w:type="dxa" w:w="80"/>
+              <w:left w:type="dxa" w:w="140"/>
+              <w:bottom w:type="dxa" w:w="80"/>
+              <w:right w:type="dxa" w:w="140"/>
+            </w:tcMar>
+          </w:tcPr>
           <w:p>
             <w:pPr>
               <w:spacing w:after="0"/>
@@ -1646,6 +2307,19 @@
                 <w:sz w:val="20"/>
                 <w:szCs w:val="20"/>
               </w:rPr>
+              <w:t xml:space="preserve">$env:PYTHONPATH = ".eval_tools"</w:t>
+            </w:r>
+          </w:p>
+          <w:p>
+            <w:pPr>
+              <w:spacing w:after="0"/>
+            </w:pPr>
+            <w:r>
+              <w:rPr>
+                <w:rFonts w:ascii="Consolas" w:cs="Consolas" w:eastAsia="Consolas" w:hAnsi="Consolas"/>
+                <w:sz w:val="20"/>
+                <w:szCs w:val="20"/>
+              </w:rPr>
               <w:t xml:space="preserve">.\.venv\Scripts\python -m eval.export_quest_model --out ..\assets\quest_model</w:t>
             </w:r>
           </w:p>
@@ -1675,7 +2349,7 @@
         <w:pStyle w:val="ListParagraph"/>
         <w:numPr>
           <w:ilvl w:val="0"/>
-          <w:numId w:val="5"/>
+          <w:numId w:val="7"/>
         </w:numPr>
         <w:spacing w:after="80"/>
       </w:pPr>
@@ -2478,7 +3152,7 @@
                 <w:sz w:val="20"/>
                 <w:szCs w:val="20"/>
               </w:rPr>
-              <w:t xml:space="preserve">Quest Van Gogh không tạo được ảnh tranh</w:t>
+              <w:t xml:space="preserve">Colab: ô 1 in "NO GPU"</w:t>
             </w:r>
           </w:p>
         </w:tc>
@@ -2507,7 +3181,385 @@
                 <w:sz w:val="20"/>
                 <w:szCs w:val="20"/>
               </w:rPr>
-              <w:t xml:space="preserve">Server laptop chưa chạy hoặc chưa nhập đúng địa chỉ/token (Bước 8.2). Việc kiểm ảnh quest vẫn chạy được mà không cần server.</w:t>
+              <w:t xml:space="preserve">Chưa chọn GPU. Runtime → Change runtime type → T4 GPU → Save, rồi chạy lại. Nếu không chọn được GPU thì Colab đang hết hạn mức GPU miễn phí, đợi vài giờ hoặc dùng tài khoản Google khác.</w:t>
+            </w:r>
+          </w:p>
+        </w:tc>
+      </w:tr>
+      <w:tr>
+        <w:trPr>
+          <w:tblHeader w:val="off"/>
+        </w:trPr>
+        <w:tc>
+          <w:tcPr>
+            <w:tcW w:type="dxa" w:w="3000"/>
+            <w:tcBorders>
+              <w:top w:val="single" w:color="BBBBBB" w:sz="4"/>
+              <w:left w:val="single" w:color="BBBBBB" w:sz="4"/>
+              <w:bottom w:val="single" w:color="BBBBBB" w:sz="4"/>
+              <w:right w:val="single" w:color="BBBBBB" w:sz="4"/>
+            </w:tcBorders>
+            <w:tcMar>
+              <w:top w:type="dxa" w:w="70"/>
+              <w:left w:type="dxa" w:w="120"/>
+              <w:bottom w:type="dxa" w:w="70"/>
+              <w:right w:type="dxa" w:w="120"/>
+            </w:tcMar>
+          </w:tcPr>
+          <w:p>
+            <w:r>
+              <w:rPr>
+                <w:rFonts w:ascii="Arial" w:cs="Arial" w:eastAsia="Arial" w:hAnsi="Arial"/>
+                <w:b w:val="false"/>
+                <w:bCs w:val="false"/>
+                <w:sz w:val="20"/>
+                <w:szCs w:val="20"/>
+              </w:rPr>
+              <w:t xml:space="preserve">Colab: ô 2 báo thiếu server.tar</w:t>
+            </w:r>
+          </w:p>
+        </w:tc>
+        <w:tc>
+          <w:tcPr>
+            <w:tcW w:type="dxa" w:w="6026"/>
+            <w:tcBorders>
+              <w:top w:val="single" w:color="BBBBBB" w:sz="4"/>
+              <w:left w:val="single" w:color="BBBBBB" w:sz="4"/>
+              <w:bottom w:val="single" w:color="BBBBBB" w:sz="4"/>
+              <w:right w:val="single" w:color="BBBBBB" w:sz="4"/>
+            </w:tcBorders>
+            <w:tcMar>
+              <w:top w:type="dxa" w:w="70"/>
+              <w:left w:type="dxa" w:w="120"/>
+              <w:bottom w:type="dxa" w:w="70"/>
+              <w:right w:type="dxa" w:w="120"/>
+            </w:tcMar>
+          </w:tcPr>
+          <w:p>
+            <w:r>
+              <w:rPr>
+                <w:rFonts w:ascii="Arial" w:cs="Arial" w:eastAsia="Arial" w:hAnsi="Arial"/>
+                <w:b w:val="false"/>
+                <w:bCs w:val="false"/>
+                <w:sz w:val="20"/>
+                <w:szCs w:val="20"/>
+              </w:rPr>
+              <w:t xml:space="preserve">Chưa tải server.tar vào Google Drive đúng thư mục MyDrive/locket (xem phần thiết lập Colab một lần).</w:t>
+            </w:r>
+          </w:p>
+        </w:tc>
+      </w:tr>
+      <w:tr>
+        <w:trPr>
+          <w:tblHeader w:val="off"/>
+        </w:trPr>
+        <w:tc>
+          <w:tcPr>
+            <w:tcW w:type="dxa" w:w="3000"/>
+            <w:tcBorders>
+              <w:top w:val="single" w:color="BBBBBB" w:sz="4"/>
+              <w:left w:val="single" w:color="BBBBBB" w:sz="4"/>
+              <w:bottom w:val="single" w:color="BBBBBB" w:sz="4"/>
+              <w:right w:val="single" w:color="BBBBBB" w:sz="4"/>
+            </w:tcBorders>
+            <w:tcMar>
+              <w:top w:type="dxa" w:w="70"/>
+              <w:left w:type="dxa" w:w="120"/>
+              <w:bottom w:type="dxa" w:w="70"/>
+              <w:right w:type="dxa" w:w="120"/>
+            </w:tcMar>
+          </w:tcPr>
+          <w:p>
+            <w:r>
+              <w:rPr>
+                <w:rFonts w:ascii="Arial" w:cs="Arial" w:eastAsia="Arial" w:hAnsi="Arial"/>
+                <w:b w:val="false"/>
+                <w:bCs w:val="false"/>
+                <w:sz w:val="20"/>
+                <w:szCs w:val="20"/>
+              </w:rPr>
+              <w:t xml:space="preserve">Colab: ô 3 báo CalledProcessError khi cài thư viện</w:t>
+            </w:r>
+          </w:p>
+        </w:tc>
+        <w:tc>
+          <w:tcPr>
+            <w:tcW w:type="dxa" w:w="6026"/>
+            <w:tcBorders>
+              <w:top w:val="single" w:color="BBBBBB" w:sz="4"/>
+              <w:left w:val="single" w:color="BBBBBB" w:sz="4"/>
+              <w:bottom w:val="single" w:color="BBBBBB" w:sz="4"/>
+              <w:right w:val="single" w:color="BBBBBB" w:sz="4"/>
+            </w:tcBorders>
+            <w:tcMar>
+              <w:top w:type="dxa" w:w="70"/>
+              <w:left w:type="dxa" w:w="120"/>
+              <w:bottom w:type="dxa" w:w="70"/>
+              <w:right w:type="dxa" w:w="120"/>
+            </w:tcMar>
+          </w:tcPr>
+          <w:p>
+            <w:r>
+              <w:rPr>
+                <w:rFonts w:ascii="Arial" w:cs="Arial" w:eastAsia="Arial" w:hAnsi="Arial"/>
+                <w:b w:val="false"/>
+                <w:bCs w:val="false"/>
+                <w:sz w:val="20"/>
+                <w:szCs w:val="20"/>
+              </w:rPr>
+              <w:t xml:space="preserve">Đọc các dòng lỗi phía trên dòng CalledProcessError để biết thư viện nào lỗi. Thường chỉ cần Disconnect and delete runtime rồi chạy lại từ đầu (mạng bị đứt giữa chừng).</w:t>
+            </w:r>
+          </w:p>
+        </w:tc>
+      </w:tr>
+      <w:tr>
+        <w:trPr>
+          <w:tblHeader w:val="off"/>
+        </w:trPr>
+        <w:tc>
+          <w:tcPr>
+            <w:tcW w:type="dxa" w:w="3000"/>
+            <w:tcBorders>
+              <w:top w:val="single" w:color="BBBBBB" w:sz="4"/>
+              <w:left w:val="single" w:color="BBBBBB" w:sz="4"/>
+              <w:bottom w:val="single" w:color="BBBBBB" w:sz="4"/>
+              <w:right w:val="single" w:color="BBBBBB" w:sz="4"/>
+            </w:tcBorders>
+            <w:tcMar>
+              <w:top w:type="dxa" w:w="70"/>
+              <w:left w:type="dxa" w:w="120"/>
+              <w:bottom w:type="dxa" w:w="70"/>
+              <w:right w:type="dxa" w:w="120"/>
+            </w:tcMar>
+          </w:tcPr>
+          <w:p>
+            <w:r>
+              <w:rPr>
+                <w:rFonts w:ascii="Arial" w:cs="Arial" w:eastAsia="Arial" w:hAnsi="Arial"/>
+                <w:b w:val="false"/>
+                <w:bCs w:val="false"/>
+                <w:sz w:val="20"/>
+                <w:szCs w:val="20"/>
+              </w:rPr>
+              <w:t xml:space="preserve">Colab: ô 4 báo hết dung lượng Drive</w:t>
+            </w:r>
+          </w:p>
+        </w:tc>
+        <w:tc>
+          <w:tcPr>
+            <w:tcW w:type="dxa" w:w="6026"/>
+            <w:tcBorders>
+              <w:top w:val="single" w:color="BBBBBB" w:sz="4"/>
+              <w:left w:val="single" w:color="BBBBBB" w:sz="4"/>
+              <w:bottom w:val="single" w:color="BBBBBB" w:sz="4"/>
+              <w:right w:val="single" w:color="BBBBBB" w:sz="4"/>
+            </w:tcBorders>
+            <w:tcMar>
+              <w:top w:type="dxa" w:w="70"/>
+              <w:left w:type="dxa" w:w="120"/>
+              <w:bottom w:type="dxa" w:w="70"/>
+              <w:right w:type="dxa" w:w="120"/>
+            </w:tcMar>
+          </w:tcPr>
+          <w:p>
+            <w:r>
+              <w:rPr>
+                <w:rFonts w:ascii="Arial" w:cs="Arial" w:eastAsia="Arial" w:hAnsi="Arial"/>
+                <w:b w:val="false"/>
+                <w:bCs w:val="false"/>
+                <w:sz w:val="20"/>
+                <w:szCs w:val="20"/>
+              </w:rPr>
+              <w:t xml:space="preserve">Cần khoảng 7 GB trống trên Google Drive cho file models.tar.</w:t>
+            </w:r>
+          </w:p>
+        </w:tc>
+      </w:tr>
+      <w:tr>
+        <w:trPr>
+          <w:tblHeader w:val="off"/>
+        </w:trPr>
+        <w:tc>
+          <w:tcPr>
+            <w:tcW w:type="dxa" w:w="3000"/>
+            <w:tcBorders>
+              <w:top w:val="single" w:color="BBBBBB" w:sz="4"/>
+              <w:left w:val="single" w:color="BBBBBB" w:sz="4"/>
+              <w:bottom w:val="single" w:color="BBBBBB" w:sz="4"/>
+              <w:right w:val="single" w:color="BBBBBB" w:sz="4"/>
+            </w:tcBorders>
+            <w:tcMar>
+              <w:top w:type="dxa" w:w="70"/>
+              <w:left w:type="dxa" w:w="120"/>
+              <w:bottom w:type="dxa" w:w="70"/>
+              <w:right w:type="dxa" w:w="120"/>
+            </w:tcMar>
+          </w:tcPr>
+          <w:p>
+            <w:r>
+              <w:rPr>
+                <w:rFonts w:ascii="Arial" w:cs="Arial" w:eastAsia="Arial" w:hAnsi="Arial"/>
+                <w:b w:val="false"/>
+                <w:bCs w:val="false"/>
+                <w:sz w:val="20"/>
+                <w:szCs w:val="20"/>
+              </w:rPr>
+              <w:t xml:space="preserve">App báo TEST thất bại với địa chỉ Colab</w:t>
+            </w:r>
+          </w:p>
+        </w:tc>
+        <w:tc>
+          <w:tcPr>
+            <w:tcW w:type="dxa" w:w="6026"/>
+            <w:tcBorders>
+              <w:top w:val="single" w:color="BBBBBB" w:sz="4"/>
+              <w:left w:val="single" w:color="BBBBBB" w:sz="4"/>
+              <w:bottom w:val="single" w:color="BBBBBB" w:sz="4"/>
+              <w:right w:val="single" w:color="BBBBBB" w:sz="4"/>
+            </w:tcBorders>
+            <w:tcMar>
+              <w:top w:type="dxa" w:w="70"/>
+              <w:left w:type="dxa" w:w="120"/>
+              <w:bottom w:type="dxa" w:w="70"/>
+              <w:right w:type="dxa" w:w="120"/>
+            </w:tcMar>
+          </w:tcPr>
+          <w:p>
+            <w:r>
+              <w:rPr>
+                <w:rFonts w:ascii="Arial" w:cs="Arial" w:eastAsia="Arial" w:hAnsi="Arial"/>
+                <w:b w:val="false"/>
+                <w:bCs w:val="false"/>
+                <w:sz w:val="20"/>
+                <w:szCs w:val="20"/>
+              </w:rPr>
+              <w:t xml:space="preserve">Địa chỉ đã cũ (đổi mỗi phiên), phiên Colab đã bị ngắt, hoặc sai token. Mở lại notebook, xem địa chỉ mới ở ô cuối, nhập lại vào app.</w:t>
+            </w:r>
+          </w:p>
+        </w:tc>
+      </w:tr>
+      <w:tr>
+        <w:trPr>
+          <w:tblHeader w:val="off"/>
+        </w:trPr>
+        <w:tc>
+          <w:tcPr>
+            <w:tcW w:type="dxa" w:w="3000"/>
+            <w:tcBorders>
+              <w:top w:val="single" w:color="BBBBBB" w:sz="4"/>
+              <w:left w:val="single" w:color="BBBBBB" w:sz="4"/>
+              <w:bottom w:val="single" w:color="BBBBBB" w:sz="4"/>
+              <w:right w:val="single" w:color="BBBBBB" w:sz="4"/>
+            </w:tcBorders>
+            <w:tcMar>
+              <w:top w:type="dxa" w:w="70"/>
+              <w:left w:type="dxa" w:w="120"/>
+              <w:bottom w:type="dxa" w:w="70"/>
+              <w:right w:type="dxa" w:w="120"/>
+            </w:tcMar>
+          </w:tcPr>
+          <w:p>
+            <w:r>
+              <w:rPr>
+                <w:rFonts w:ascii="Arial" w:cs="Arial" w:eastAsia="Arial" w:hAnsi="Arial"/>
+                <w:b w:val="false"/>
+                <w:bCs w:val="false"/>
+                <w:sz w:val="20"/>
+                <w:szCs w:val="20"/>
+              </w:rPr>
+              <w:t xml:space="preserve">Đang dùng thì app không tạo được ảnh Van Gogh nữa</w:t>
+            </w:r>
+          </w:p>
+        </w:tc>
+        <w:tc>
+          <w:tcPr>
+            <w:tcW w:type="dxa" w:w="6026"/>
+            <w:tcBorders>
+              <w:top w:val="single" w:color="BBBBBB" w:sz="4"/>
+              <w:left w:val="single" w:color="BBBBBB" w:sz="4"/>
+              <w:bottom w:val="single" w:color="BBBBBB" w:sz="4"/>
+              <w:right w:val="single" w:color="BBBBBB" w:sz="4"/>
+            </w:tcBorders>
+            <w:tcMar>
+              <w:top w:type="dxa" w:w="70"/>
+              <w:left w:type="dxa" w:w="120"/>
+              <w:bottom w:type="dxa" w:w="70"/>
+              <w:right w:type="dxa" w:w="120"/>
+            </w:tcMar>
+          </w:tcPr>
+          <w:p>
+            <w:r>
+              <w:rPr>
+                <w:rFonts w:ascii="Arial" w:cs="Arial" w:eastAsia="Arial" w:hAnsi="Arial"/>
+                <w:b w:val="false"/>
+                <w:bCs w:val="false"/>
+                <w:sz w:val="20"/>
+                <w:szCs w:val="20"/>
+              </w:rPr>
+              <w:t xml:space="preserve">Colab free có thể ngắt phiên bất cứ lúc nào. Bật lại notebook (Run all) và nhập địa chỉ mới.</w:t>
+            </w:r>
+          </w:p>
+        </w:tc>
+      </w:tr>
+      <w:tr>
+        <w:trPr>
+          <w:tblHeader w:val="off"/>
+        </w:trPr>
+        <w:tc>
+          <w:tcPr>
+            <w:tcW w:type="dxa" w:w="3000"/>
+            <w:tcBorders>
+              <w:top w:val="single" w:color="BBBBBB" w:sz="4"/>
+              <w:left w:val="single" w:color="BBBBBB" w:sz="4"/>
+              <w:bottom w:val="single" w:color="BBBBBB" w:sz="4"/>
+              <w:right w:val="single" w:color="BBBBBB" w:sz="4"/>
+            </w:tcBorders>
+            <w:tcMar>
+              <w:top w:type="dxa" w:w="70"/>
+              <w:left w:type="dxa" w:w="120"/>
+              <w:bottom w:type="dxa" w:w="70"/>
+              <w:right w:type="dxa" w:w="120"/>
+            </w:tcMar>
+          </w:tcPr>
+          <w:p>
+            <w:r>
+              <w:rPr>
+                <w:rFonts w:ascii="Arial" w:cs="Arial" w:eastAsia="Arial" w:hAnsi="Arial"/>
+                <w:b w:val="false"/>
+                <w:bCs w:val="false"/>
+                <w:sz w:val="20"/>
+                <w:szCs w:val="20"/>
+              </w:rPr>
+              <w:t xml:space="preserve">Quest Van Gogh không tạo được ảnh tranh</w:t>
+            </w:r>
+          </w:p>
+        </w:tc>
+        <w:tc>
+          <w:tcPr>
+            <w:tcW w:type="dxa" w:w="6026"/>
+            <w:tcBorders>
+              <w:top w:val="single" w:color="BBBBBB" w:sz="4"/>
+              <w:left w:val="single" w:color="BBBBBB" w:sz="4"/>
+              <w:bottom w:val="single" w:color="BBBBBB" w:sz="4"/>
+              <w:right w:val="single" w:color="BBBBBB" w:sz="4"/>
+            </w:tcBorders>
+            <w:tcMar>
+              <w:top w:type="dxa" w:w="70"/>
+              <w:left w:type="dxa" w:w="120"/>
+              <w:bottom w:type="dxa" w:w="70"/>
+              <w:right w:type="dxa" w:w="120"/>
+            </w:tcMar>
+          </w:tcPr>
+          <w:p>
+            <w:r>
+              <w:rPr>
+                <w:rFonts w:ascii="Arial" w:cs="Arial" w:eastAsia="Arial" w:hAnsi="Arial"/>
+                <w:b w:val="false"/>
+                <w:bCs w:val="false"/>
+                <w:sz w:val="20"/>
+                <w:szCs w:val="20"/>
+              </w:rPr>
+              <w:t xml:space="preserve">Chưa nhập server, notebook Colab chưa chạy hoặc đã bị ngắt phiên (bật lại, địa chỉ sẽ đổi), hoặc sai địa chỉ/token (Bước 8.2). Việc kiểm ảnh quest vẫn chạy được mà không cần server.</w:t>
             </w:r>
           </w:p>
         </w:tc>
@@ -2731,6 +3783,30 @@
       </w:pPr>
     </w:lvl>
   </w:abstractNum>
+  <w:abstractNum w:abstractNumId="6" w15:restartNumberingAfterBreak="0">
+    <w:multiLevelType w:val="hybridMultilevel"/>
+    <w:lvl w:ilvl="0" w:tentative="1">
+      <w:start w:val="1"/>
+      <w:numFmt w:val="decimal"/>
+      <w:lvlText w:val="%1."/>
+      <w:lvlJc w:val="left"/>
+      <w:pPr>
+        <w:ind w:left="540" w:hanging="360"/>
+      </w:pPr>
+    </w:lvl>
+  </w:abstractNum>
+  <w:abstractNum w:abstractNumId="7" w15:restartNumberingAfterBreak="0">
+    <w:multiLevelType w:val="hybridMultilevel"/>
+    <w:lvl w:ilvl="0" w:tentative="1">
+      <w:start w:val="1"/>
+      <w:numFmt w:val="decimal"/>
+      <w:lvlText w:val="%1."/>
+      <w:lvlJc w:val="left"/>
+      <w:pPr>
+        <w:ind w:left="540" w:hanging="360"/>
+      </w:pPr>
+    </w:lvl>
+  </w:abstractNum>
   <w:num w:numId="1">
     <w:abstractNumId w:val="1"/>
     <w:lvlOverride w:ilvl="0">
@@ -2744,7 +3820,7 @@
     </w:lvlOverride>
   </w:num>
   <w:num w:numId="3">
-    <w:abstractNumId w:val="5"/>
+    <w:abstractNumId w:val="7"/>
     <w:lvlOverride w:ilvl="0">
       <w:startOverride w:val="1"/>
     </w:lvlOverride>
@@ -2756,6 +3832,18 @@
     </w:lvlOverride>
   </w:num>
   <w:num w:numId="5">
+    <w:abstractNumId w:val="6"/>
+    <w:lvlOverride w:ilvl="0">
+      <w:startOverride w:val="1"/>
+    </w:lvlOverride>
+  </w:num>
+  <w:num w:numId="6">
+    <w:abstractNumId w:val="5"/>
+    <w:lvlOverride w:ilvl="0">
+      <w:startOverride w:val="1"/>
+    </w:lvlOverride>
+  </w:num>
+  <w:num w:numId="7">
     <w:abstractNumId w:val="4"/>
     <w:lvlOverride w:ilvl="0">
       <w:startOverride w:val="1"/>

</xml_diff>